<commit_message>
refined flashcard and documentation
</commit_message>
<xml_diff>
--- a/documentazione/DocumentazioneModulo306.docx
+++ b/documentazione/DocumentazioneModulo306.docx
@@ -2031,13 +2031,93 @@
     </w:p>
     <w:p>
       <w:r>
-        <w:t xml:space="preserve">Quest’applicazione conterrà un timer per </w:t>
+        <w:t>Quest’applicazione conterrà un timer per gest</w:t>
+      </w:r>
+      <w:r>
+        <w:t>ire i momenti di studio</w:t>
+      </w:r>
+      <w:r>
+        <w:t xml:space="preserve"> e le pause.</w:t>
+      </w:r>
+    </w:p>
+    <w:p>
+      <w:r>
+        <w:t>Una sezione per gestire i task dello studente.</w:t>
+      </w:r>
+    </w:p>
+    <w:p>
+      <w:r>
+        <w:t xml:space="preserve">Una schermata che permette all’utente di inserire un argomento sulla quale vorrebbe farsi generare delle </w:t>
       </w:r>
       <w:proofErr w:type="spellStart"/>
       <w:r>
-        <w:t>gest</w:t>
+        <w:t>flashcard</w:t>
       </w:r>
       <w:proofErr w:type="spellEnd"/>
+      <w:r>
+        <w:t xml:space="preserve"> e </w:t>
+      </w:r>
+      <w:proofErr w:type="spellStart"/>
+      <w:r>
+        <w:t>dopodiche</w:t>
+      </w:r>
+      <w:proofErr w:type="spellEnd"/>
+      <w:r>
+        <w:t xml:space="preserve"> tramite una chiamata alla API di </w:t>
+      </w:r>
+      <w:proofErr w:type="spellStart"/>
+      <w:r>
+        <w:t>Ollama</w:t>
+      </w:r>
+      <w:proofErr w:type="spellEnd"/>
+      <w:r>
+        <w:t xml:space="preserve"> genera un </w:t>
+      </w:r>
+      <w:proofErr w:type="spellStart"/>
+      <w:r>
+        <w:t>json</w:t>
+      </w:r>
+      <w:proofErr w:type="spellEnd"/>
+      <w:r>
+        <w:t xml:space="preserve"> che popolerà le </w:t>
+      </w:r>
+      <w:proofErr w:type="spellStart"/>
+      <w:r>
+        <w:t>flashcard</w:t>
+      </w:r>
+      <w:proofErr w:type="spellEnd"/>
+      <w:r>
+        <w:t xml:space="preserve"> (L’API di </w:t>
+      </w:r>
+      <w:proofErr w:type="spellStart"/>
+      <w:r>
+        <w:t>Ollama</w:t>
+      </w:r>
+      <w:proofErr w:type="spellEnd"/>
+      <w:r>
+        <w:t xml:space="preserve"> rispetto al altre sul mercato permette di avere chiamate in modo gratuito).</w:t>
+      </w:r>
+    </w:p>
+    <w:p>
+      <w:r>
+        <w:t xml:space="preserve">Questo progetto ci è sembrato il giusto compromesso un’applicazione di base semplice ma che con l’aggiunta di creazione automatica di </w:t>
+      </w:r>
+      <w:proofErr w:type="spellStart"/>
+      <w:r>
+        <w:t>flashcard</w:t>
+      </w:r>
+      <w:proofErr w:type="spellEnd"/>
+      <w:r>
+        <w:t xml:space="preserve"> tramite AI diventa </w:t>
+      </w:r>
+      <w:proofErr w:type="gramStart"/>
+      <w:r>
+        <w:t>una progetto</w:t>
+      </w:r>
+      <w:proofErr w:type="gramEnd"/>
+      <w:r>
+        <w:t xml:space="preserve"> leggermente più complesso.</w:t>
+      </w:r>
     </w:p>
     <w:p>
       <w:r>
@@ -2056,7 +2136,74 @@
     </w:p>
     <w:p>
       <w:r>
-        <w:t>Per sviluppare l’applicazione per il progetto del modulo 306</w:t>
+        <w:t>Abbiamo deciso di sviluppare questa applicazione usando flutter e dart.</w:t>
+      </w:r>
+    </w:p>
+    <w:p>
+      <w:r>
+        <w:t xml:space="preserve">Flutter è una UI SDK (software developer kit) open source creata da </w:t>
+      </w:r>
+      <w:proofErr w:type="spellStart"/>
+      <w:r>
+        <w:t>google</w:t>
+      </w:r>
+      <w:proofErr w:type="spellEnd"/>
+      <w:r>
+        <w:t xml:space="preserve">, è compilata nativamente e su più piattaforme con una </w:t>
+      </w:r>
+      <w:proofErr w:type="spellStart"/>
+      <w:r>
+        <w:t>codebase</w:t>
+      </w:r>
+      <w:proofErr w:type="spellEnd"/>
+      <w:r>
+        <w:t xml:space="preserve"> unica, questo significa che il codice lo scrivi una volta sola e l’applicazione funziona su </w:t>
+      </w:r>
+      <w:proofErr w:type="spellStart"/>
+      <w:r>
+        <w:t>ios</w:t>
+      </w:r>
+      <w:proofErr w:type="spellEnd"/>
+      <w:r>
+        <w:t xml:space="preserve">, </w:t>
+      </w:r>
+      <w:proofErr w:type="spellStart"/>
+      <w:r>
+        <w:t>android</w:t>
+      </w:r>
+      <w:proofErr w:type="spellEnd"/>
+      <w:r>
+        <w:t xml:space="preserve">, windows, </w:t>
+      </w:r>
+      <w:proofErr w:type="spellStart"/>
+      <w:r>
+        <w:t>linux</w:t>
+      </w:r>
+      <w:proofErr w:type="spellEnd"/>
+      <w:r>
+        <w:t xml:space="preserve">, </w:t>
+      </w:r>
+      <w:proofErr w:type="spellStart"/>
+      <w:r>
+        <w:t>ecc</w:t>
+      </w:r>
+      <w:proofErr w:type="spellEnd"/>
+      <w:r>
+        <w:t xml:space="preserve">… Flutter è strutturato in widget, questo vuol dire che ogni pixel dello schermo può essere controllato, questi variano da elementi strutturali fino a stili. Flutter porta con </w:t>
+      </w:r>
+      <w:r>
+        <w:t>sé</w:t>
+      </w:r>
+      <w:r>
+        <w:t xml:space="preserve"> la possibilità di fare l’hot </w:t>
+      </w:r>
+      <w:proofErr w:type="spellStart"/>
+      <w:r>
+        <w:t>reload</w:t>
+      </w:r>
+      <w:proofErr w:type="spellEnd"/>
+      <w:r>
+        <w:t xml:space="preserve"> e questo vuol dire che puoi vedere gli aggiornamenti della tua app in tempo reale senza perdere gli stati dell’app.</w:t>
       </w:r>
     </w:p>
     <w:sectPr>

</xml_diff>